<commit_message>
Forgot to upload tell_the_court_content.docx to match yml template in last commit
</commit_message>
<xml_diff>
--- a/docassemble/AKA2JBranding/data/templates/tell_the_court_content.docx
+++ b/docassemble/AKA2JBranding/data/templates/tell_the_court_content.docx
@@ -10,31 +10,19 @@
         <w:rPr>
           <w:color w:val="FF0000"/>
         </w:rPr>
-        <w:t>{</w:t>
+        <w:t>{%</w:t>
       </w:r>
       <w:r>
         <w:rPr>
           <w:color w:val="FF0000"/>
         </w:rPr>
-        <w:t>%</w:t>
+        <w:t>p</w:t>
       </w:r>
       <w:r>
         <w:rPr>
           <w:color w:val="FF0000"/>
         </w:rPr>
-        <w:t>p</w:t>
-      </w:r>
-      <w:r>
-        <w:rPr>
-          <w:color w:val="FF0000"/>
-        </w:rPr>
-        <w:t xml:space="preserve"> if user_need == 'change AK order'</w:t>
-      </w:r>
-      <w:r>
-        <w:rPr>
-          <w:color w:val="FF0000"/>
-        </w:rPr>
-        <w:t xml:space="preserve"> %}</w:t>
+        <w:t xml:space="preserve"> if user_need == 'change AK order' %}</w:t>
       </w:r>
     </w:p>
     <w:p>
@@ -300,21 +288,7 @@
             <w:rStyle w:val="Hyperlink"/>
             <w:bCs/>
           </w:rPr>
-          <w:t xml:space="preserve">Fill </w:t>
-        </w:r>
-        <w:r>
-          <w:rPr>
-            <w:rStyle w:val="Hyperlink"/>
-            <w:bCs/>
-          </w:rPr>
-          <w:t>i</w:t>
-        </w:r>
-        <w:r>
-          <w:rPr>
-            <w:rStyle w:val="Hyperlink"/>
-            <w:bCs/>
-          </w:rPr>
-          <w:t>n PDF</w:t>
+          <w:t>Fill in PDF</w:t>
         </w:r>
       </w:hyperlink>
       <w:r>
@@ -1424,7 +1398,31 @@
         <w:rPr>
           <w:color w:val="FF0000"/>
         </w:rPr>
-        <w:t xml:space="preserve"> if middle_of_case == 'no'</w:t>
+        <w:t xml:space="preserve"> if </w:t>
+      </w:r>
+      <w:r>
+        <w:rPr>
+          <w:color w:val="FF0000"/>
+        </w:rPr>
+        <w:t>(</w:t>
+      </w:r>
+      <w:r>
+        <w:rPr>
+          <w:color w:val="FFC000"/>
+        </w:rPr>
+        <w:t>user_need == 'change AK order' and parents_agree</w:t>
+      </w:r>
+      <w:r>
+        <w:rPr>
+          <w:color w:val="FF0000"/>
+        </w:rPr>
+        <w:t xml:space="preserve">) or </w:t>
+      </w:r>
+      <w:r>
+        <w:rPr>
+          <w:color w:val="FF0000"/>
+        </w:rPr>
+        <w:t>middle_of_case == 'no'</w:t>
       </w:r>
       <w:r>
         <w:rPr>

</xml_diff>